<commit_message>
Free downloads: ferieloven § 29 set-off limit in clawback templates, large-deal rule in commission plan (DA + EN)
- clawback-regler-skabelon.docx / commission-clawback-policy-template.docx: clause 5.4 and 7.2 options and the guidance
  now state that no set-off is made against løn under ferie, ferietillæg or feriegodtgørelse unless the claim stems
  from an admitted or court-established wrongful act (ferieloven § 29, LBK nr. 152 af 20/02/2024); source added.
- provisionsplan-skabelon.docx / commission-plan-template.docx: clause 13.3 now says commission on deals above the
  threshold is agreed in writing between company and rep before the deal is closed, otherwise the normal rules
  apply; the cap guidance points to it.

Co-Authored-By: Claude Opus 5.5 <noreply@anthropic.com>
Claude-Session: https://claude.ai/code/session_015ARYWPzfpSsGpTMdh999ce
</commit_message>
<xml_diff>
--- a/downloads/clawback-regler-skabelon.docx
+++ b/downloads/clawback-regler-skabelon.docx
@@ -1490,7 +1490,7 @@
           <w:sz w:val="21"/>
           <w:shd w:val="clear" w:color="auto" w:fill="E6E0FB"/>
         </w:rPr>
-        <w:t>[Vælg: Der modregnes ikke i den faste løn. / Der modregnes også i den faste løn, dog højst ... kr. pr. måned, og kun efter skriftlig meddelelse til Medarbejderen senest 14 dage før lønudbetalingen.]</w:t>
+        <w:t>[Vælg: Der modregnes ikke i den faste løn. / Der modregnes også i den faste løn, dog højst ... kr. pr. måned, aldrig i løn under ferie, ferietillæg eller feriegodtgørelse, og kun efter skriftlig meddelelse til Medarbejderen senest 14 dage før lønudbetalingen.]</w:t>
       </w:r>
     </w:p>
     <w:p>
@@ -1524,7 +1524,7 @@
           <w:color w:val="4A4775"/>
           <w:sz w:val="19"/>
         </w:rPr>
-        <w:t>Modregning i senere provision er den sikreste løsning. En arbejdsgiver kan ikke bare trække et beløb i lønnen. Der findes ingen samlet lov om modregning i løn; reglerne kommer fra retspraksis. Som udgangspunkt skal kravet være klart, dokumenteret og forfaldent og have direkte sammenhæng med ansættelsen, og medarbejderen skal have et vist eksistensminimum tilbage. Vent ikke for længe: passivitet kan koste retten til at modregne. Har sælgeren fået forskud på provision, kan forskuddet kun dækkes af løn og provision, sælgeren har til gode (funktionærloven § 9, stk. 2). Vælger I modregning i den faste løn, så skriv et beløbsloft og en varslingsfrist, og få reglen gennemgået.</w:t>
+        <w:t>Modregning i senere provision er den sikreste løsning. En arbejdsgiver kan ikke bare trække et beløb i lønnen. Der findes ingen samlet lov om modregning i løn; reglerne kommer fra retspraksis. Som udgangspunkt skal kravet være klart, dokumenteret og forfaldent og have direkte sammenhæng med ansættelsen, og medarbejderen skal have et vist eksistensminimum tilbage. Vent ikke for længe: passivitet kan koste retten til at modregne. Har sælgeren fået forskud på provision, kan forskuddet kun dækkes af løn og provision, sælgeren har til gode (funktionærloven § 9, stk. 2). Vælger I modregning i den faste løn, så skriv et beløbsloft og en varslingsfrist, og få reglen gennemgået. Der må ikke modregnes i løn under ferie, ferietillæg eller feriegodtgørelse, medmindre kravet skyldes et retsstridigt forhold, som medarbejderen har erkendt, eller som er fastslået ved dom (ferieloven § 29). En kunde, der annullerer eller ikke betaler, er ikke i sig selv et retsstridigt forhold fra sælgerens side.</w:t>
       </w:r>
     </w:p>
     <w:p>
@@ -1721,7 +1721,7 @@
           <w:sz w:val="21"/>
           <w:shd w:val="clear" w:color="auto" w:fill="E6E0FB"/>
         </w:rPr>
-        <w:t>[Vælg: modregnes i den sidste provision / modregnes i den sidste provision og løn i det omfang, loven tillader det / bortfalder]</w:t>
+        <w:t>[Vælg: modregnes i den sidste provision / modregnes i den sidste provision og løn i det omfang, loven tillader det, dog ikke i løn under ferie, ferietillæg eller feriegodtgørelse, medmindre kravet skyldes et retsstridigt forhold, som Medarbejderen har erkendt, eller som er fastslået ved dom (ferieloven § 29) / bortfalder]</w:t>
       </w:r>
       <w:r>
         <w:rPr>
@@ -1786,7 +1786,7 @@
           <w:color w:val="4A4775"/>
           <w:sz w:val="19"/>
         </w:rPr>
-        <w:t>De samme grænser for modregning gælder i den sidste løn. Beskriv på forhånd, hvad der sker med en negativ saldo, så slutopgørelsen ikke bliver en forhandling.</w:t>
+        <w:t>De samme grænser for modregning gælder i den sidste løn. Efter ferieloven § 29 kan der ikke modregnes i løn under ferie, ferietillæg eller feriegodtgørelse, medmindre kravet skyldes et retsstridigt forhold i ansættelsen, som medarbejderen har erkendt, eller som er fastslået ved dom. En clawback, fordi en kunde har annulleret eller ikke betalt, opfylder normalt ikke den betingelse, så hold feriebeløbene uden for modregningen i slutopgørelsen. Beskriv på forhånd, hvad der sker med en negativ saldo, så slutopgørelsen ikke bliver en forhandling.</w:t>
       </w:r>
     </w:p>
     <w:p>
@@ -2493,6 +2493,36 @@
           <w:color w:val="110663"/>
           <w:sz w:val="21"/>
         </w:rPr>
+        <w:t>Ferieloven, LBK nr. 152 af 20/02/2024, § 29 (modregning i løn under ferie, ferietillæg og feriegodtgørelse): retsinformation.dk/eli/lta/2024/152</w:t>
+      </w:r>
+    </w:p>
+    <w:p>
+      <w:pPr>
+        <w:tabs>
+          <w:tab w:pos="567" w:val="left"/>
+        </w:tabs>
+        <w:spacing w:before="0" w:after="80" w:line="276" w:lineRule="auto"/>
+        <w:ind w:left="567" w:hanging="283"/>
+      </w:pPr>
+      <w:r>
+        <w:rPr>
+          <w:rFonts w:ascii="Arial" w:hAnsi="Arial" w:cs="Arial" w:eastAsia="Arial"/>
+          <w:b w:val="0"/>
+          <w:i w:val="0"/>
+          <w:color w:val="4C39CA"/>
+          <w:sz w:val="21"/>
+        </w:rPr>
+        <w:t>•</w:t>
+        <w:tab/>
+      </w:r>
+      <w:r>
+        <w:rPr>
+          <w:rFonts w:ascii="Arial" w:hAnsi="Arial" w:cs="Arial" w:eastAsia="Arial"/>
+          <w:b w:val="0"/>
+          <w:i w:val="0"/>
+          <w:color w:val="110663"/>
+          <w:sz w:val="21"/>
+        </w:rPr>
         <w:t>Lov om ansættelsesbeviser og visse arbejdsvilkår, lov nr. 501 af 16/05/2023, §§ 3 og 5: retsinformation.dk/eli/lta/2023/501</w:t>
       </w:r>
     </w:p>

</xml_diff>